<commit_message>
Update documentation for ranking features
</commit_message>
<xml_diff>
--- a/docs/AI_Resume_Builder_Project_Documentation.docx
+++ b/docs/AI_Resume_Builder_Project_Documentation.docx
@@ -5535,6 +5535,162 @@
         <w:t>AI Resume Builder demonstrates a complete full-stack workflow with frontend UI, backend APIs, database authentication, resume parsing, NLP, semantic matching, AI-generated content, and deployment-ready structure. It is a practical project because it solves a real job-search problem and combines multiple important engineering concepts in one application.</w:t>
       </w:r>
     </w:p>
+    <w:p>
+      <w:pPr>
+        <w:pStyle w:val="Heading1"/>
+      </w:pPr>
+      <w:r>
+        <w:t>24. Candidate Discovery and Resume Ranking Engine</w:t>
+      </w:r>
+    </w:p>
+    <w:p>
+      <w:r>
+        <w:t>The project now includes an Intelligent Candidate Discovery and Ranking Engine. This feature extends the original single-resume job matcher into a recruiter-focused ranking workflow. Users can paste a job description, upload either a structured candidate dataset or multiple resume files, and receive a ranked list with explainable scoring.</w:t>
+      </w:r>
+    </w:p>
+    <w:p>
+      <w:pPr>
+        <w:pStyle w:val="Heading2"/>
+      </w:pPr>
+      <w:r>
+        <w:t>24.1 Ranking Input Modes</w:t>
+      </w:r>
+    </w:p>
+    <w:p>
+      <w:pPr>
+        <w:pStyle w:val="ListBullet"/>
+      </w:pPr>
+      <w:r>
+        <w:t>JSON / JSONL candidate dataset: The Candidate Ranker can process candidate profiles that follow the Redrob-style schema, including profile metadata, career history, education, skills, certifications, languages, and Redrob behavioral signals.</w:t>
+      </w:r>
+    </w:p>
+    <w:p>
+      <w:pPr>
+        <w:pStyle w:val="ListBullet"/>
+      </w:pPr>
+      <w:r>
+        <w:t>Resume PDF / DOCX files: Users can upload multiple resumes one by one or in batches. The backend extracts readable text from each file and ranks those resumes against the pasted job description.</w:t>
+      </w:r>
+    </w:p>
+    <w:p>
+      <w:pPr>
+        <w:pStyle w:val="Heading2"/>
+      </w:pPr>
+      <w:r>
+        <w:t>24.2 Backend Ranking Logic</w:t>
+      </w:r>
+    </w:p>
+    <w:p>
+      <w:r>
+        <w:t>The ranking logic is implemented in backend/utils/candidate_ranker.py. It is deterministic and CPU-friendly. The system does not call hosted LLM APIs during ranking, which makes it suitable for scalable candidate screening workflows.</w:t>
+      </w:r>
+    </w:p>
+    <w:p>
+      <w:pPr>
+        <w:pStyle w:val="ListBullet"/>
+      </w:pPr>
+      <w:r>
+        <w:t>For structured candidates, the ranker scores skills, career history, title fit, production AI/retrieval evidence, ranking/evaluation evidence, experience fit, company/industry fit, location fit, and behavioral availability signals.</w:t>
+      </w:r>
+    </w:p>
+    <w:p>
+      <w:pPr>
+        <w:pStyle w:val="ListBullet"/>
+      </w:pPr>
+      <w:r>
+        <w:t>For uploaded resumes, the ranker scores extracted text for JD overlap, AI/retrieval/ranking keywords, production evidence, evaluation terms such as NDCG/MRR/MAP, inferred experience years, and weak-title penalties.</w:t>
+      </w:r>
+    </w:p>
+    <w:p>
+      <w:pPr>
+        <w:pStyle w:val="ListBullet"/>
+      </w:pPr>
+      <w:r>
+        <w:t>The response includes rank, score, reasoning, and internal score details so rankings are explainable instead of being only keyword matches.</w:t>
+      </w:r>
+    </w:p>
+    <w:p>
+      <w:pPr>
+        <w:pStyle w:val="Heading2"/>
+      </w:pPr>
+      <w:r>
+        <w:t>24.3 New API Endpoints</w:t>
+      </w:r>
+    </w:p>
+    <w:p>
+      <w:pPr>
+        <w:pStyle w:val="ListBullet"/>
+      </w:pPr>
+      <w:r>
+        <w:t>POST /api/rank-candidates accepts a candidates file under the form field candidates, plus job_description and top_n. It returns rankings and a CSV with candidate_id, rank, score, and reasoning.</w:t>
+      </w:r>
+    </w:p>
+    <w:p>
+      <w:pPr>
+        <w:pStyle w:val="ListBullet"/>
+      </w:pPr>
+      <w:r>
+        <w:t>POST /api/rank-resumes accepts multiple files under the form field resumes, plus job_description and top_n. It extracts text from PDF/DOCX resumes and returns rankings and a CSV with filename, rank, score, and reasoning.</w:t>
+      </w:r>
+    </w:p>
+    <w:p>
+      <w:pPr>
+        <w:pStyle w:val="Heading2"/>
+      </w:pPr>
+      <w:r>
+        <w:t>24.4 Frontend Workflow</w:t>
+      </w:r>
+    </w:p>
+    <w:p>
+      <w:r>
+        <w:t>The Candidate Ranker tab inside the Resume Intelligence module now has two modes: JSON Dataset and Resume PDFs. In JSON Dataset mode, users upload a .json or .jsonl candidate file. In Resume PDFs mode, users add multiple PDF/DOCX resumes, remove individual files if needed, paste the job description, and click Rank Resumes. The UI previews the top ranked results and provides a CSV download.</w:t>
+      </w:r>
+    </w:p>
+    <w:p>
+      <w:pPr>
+        <w:pStyle w:val="Heading2"/>
+      </w:pPr>
+      <w:r>
+        <w:t>24.5 Explainability</w:t>
+      </w:r>
+    </w:p>
+    <w:p>
+      <w:r>
+        <w:t>Each ranked result includes a short reasoning string that references extracted facts such as matched AI/retrieval terms, detected experience, production evidence, JD overlap, response rate or notice period where available, and concerns such as low readable text or weak title fit. This makes the ranking easier for recruiters and evaluators to review.</w:t>
+      </w:r>
+    </w:p>
+    <w:p>
+      <w:pPr>
+        <w:pStyle w:val="Heading2"/>
+      </w:pPr>
+      <w:r>
+        <w:t>24.6 Current Limitations and Future Improvements</w:t>
+      </w:r>
+    </w:p>
+    <w:p>
+      <w:pPr>
+        <w:pStyle w:val="ListBullet"/>
+      </w:pPr>
+      <w:r>
+        <w:t>Scanned image-only PDFs may not rank well because OCR is not currently implemented.</w:t>
+      </w:r>
+    </w:p>
+    <w:p>
+      <w:pPr>
+        <w:pStyle w:val="ListBullet"/>
+      </w:pPr>
+      <w:r>
+        <w:t>Resume ranking uses deterministic text features rather than semantic embeddings, so future versions could add local embeddings or BM25-style retrieval for stronger matching.</w:t>
+      </w:r>
+    </w:p>
+    <w:p>
+      <w:pPr>
+        <w:pStyle w:val="ListBullet"/>
+      </w:pPr>
+      <w:r>
+        <w:t>The ranking output is currently processed in request/response style. For very large batches, background jobs and progress tracking would improve user experience.</w:t>
+      </w:r>
+    </w:p>
     <w:sectPr>
       <w:footerReference w:type="default" r:id="rId9"/>
       <w:pgSz w:w="12240" w:h="15840"/>

</xml_diff>